<commit_message>
Update CA1 and CA2 assignment content
</commit_message>
<xml_diff>
--- a/Digital Forensics and eDiscovery/CA1-Digital-Forensics-eDiscovery.docx.docx
+++ b/Digital Forensics and eDiscovery/CA1-Digital-Forensics-eDiscovery.docx.docx
@@ -142,39 +142,34 @@
           <w:sz w:val="26"/>
           <w:szCs w:val="26"/>
         </w:rPr>
-        <w:t>Semester:</w:t>
+        <w:t xml:space="preserve">Topic: </w:t>
       </w:r>
       <w:r>
         <w:rPr>
           <w:rFonts w:ascii="Times New Roman" w:hAnsi="Times New Roman"/>
           <w:sz w:val="26"/>
           <w:szCs w:val="26"/>
-        </w:rPr>
-        <w:t xml:space="preserve">    Semester 1 </w:t>
+          <w:lang w:val="en-GB"/>
+        </w:rPr>
+        <w:t>I</w:t>
       </w:r>
       <w:r>
         <w:rPr>
           <w:rFonts w:ascii="Times New Roman" w:hAnsi="Times New Roman"/>
           <w:sz w:val="26"/>
           <w:szCs w:val="26"/>
-        </w:rPr>
-        <w:t>–</w:t>
+          <w:lang w:val="en-GB"/>
+        </w:rPr>
+        <w:t>nvestiga</w:t>
       </w:r>
       <w:r>
         <w:rPr>
           <w:rFonts w:ascii="Times New Roman" w:hAnsi="Times New Roman"/>
           <w:sz w:val="26"/>
           <w:szCs w:val="26"/>
-        </w:rPr>
-        <w:t xml:space="preserve"> </w:t>
-      </w:r>
-      <w:r>
-        <w:rPr>
-          <w:rFonts w:ascii="Times New Roman" w:hAnsi="Times New Roman"/>
-          <w:sz w:val="26"/>
-          <w:szCs w:val="26"/>
-        </w:rPr>
-        <w:t>2025</w:t>
+          <w:lang w:val="en-GB"/>
+        </w:rPr>
+        <w:t>tion of Facebook Application</w:t>
       </w:r>
     </w:p>
     <w:p>
@@ -11840,7 +11835,7 @@
           <v:shape id="_x0000_i1025" type="#_x0000_t75" style="width:76.75pt;height:49.6pt" o:ole="">
             <v:imagedata r:id="rId59" o:title=""/>
           </v:shape>
-          <o:OLEObject Type="Embed" ProgID="Excel.SheetMacroEnabled.12" ShapeID="_x0000_i1025" DrawAspect="Icon" ObjectID="_1836598739" r:id="rId60"/>
+          <o:OLEObject Type="Embed" ProgID="Excel.SheetMacroEnabled.12" ShapeID="_x0000_i1025" DrawAspect="Icon" ObjectID="_1836600748" r:id="rId60"/>
         </w:object>
       </w:r>
     </w:p>
@@ -16501,7 +16496,6 @@
   <w:style w:type="character" w:default="1" w:styleId="DefaultParagraphFont">
     <w:name w:val="Default Paragraph Font"/>
     <w:uiPriority w:val="1"/>
-    <w:semiHidden/>
     <w:unhideWhenUsed/>
   </w:style>
   <w:style w:type="table" w:default="1" w:styleId="TableNormal">
@@ -16814,8 +16808,10 @@
     <w:rsid w:val="004A6817"/>
     <w:rsid w:val="00561E80"/>
     <w:rsid w:val="006011A7"/>
+    <w:rsid w:val="007F11E7"/>
     <w:rsid w:val="00D17319"/>
     <w:rsid w:val="00DF651E"/>
+    <w:rsid w:val="00E7302D"/>
     <w:rsid w:val="00FD32A5"/>
     <w:rsid w:val="00FF22F6"/>
   </w:rsids>
@@ -17624,16 +17620,6 @@
 </file>
 
 <file path=customXml/item1.xml><?xml version="1.0" encoding="utf-8"?>
-<p:properties xmlns:p="http://schemas.microsoft.com/office/2006/metadata/properties" xmlns:xsi="http://www.w3.org/2001/XMLSchema-instance" xmlns:pc="http://schemas.microsoft.com/office/infopath/2007/PartnerControls">
-  <documentManagement/>
-</p:properties>
-</file>
-
-<file path=customXml/item2.xml><?xml version="1.0" encoding="utf-8"?>
-<b:Sources xmlns:b="http://schemas.openxmlformats.org/officeDocument/2006/bibliography" xmlns="http://schemas.openxmlformats.org/officeDocument/2006/bibliography" SelectedStyle="\HarvardAnglia2008OfficeOnline.xsl" StyleName="Harvard - Anglia" Version="2008"/>
-</file>
-
-<file path=customXml/item3.xml><?xml version="1.0" encoding="utf-8"?>
 <?mso-contentType ?>
 <FormTemplates xmlns="http://schemas.microsoft.com/sharepoint/v3/contenttype/forms">
   <Display>DocumentLibraryForm</Display>
@@ -17642,7 +17628,13 @@
 </FormTemplates>
 </file>
 
-<file path=customXml/item4.xml><?xml version="1.0" encoding="utf-8"?>
+<file path=customXml/item2.xml><?xml version="1.0" encoding="utf-8"?>
+<p:properties xmlns:p="http://schemas.microsoft.com/office/2006/metadata/properties" xmlns:xsi="http://www.w3.org/2001/XMLSchema-instance" xmlns:pc="http://schemas.microsoft.com/office/infopath/2007/PartnerControls">
+  <documentManagement/>
+</p:properties>
+</file>
+
+<file path=customXml/item3.xml><?xml version="1.0" encoding="utf-8"?>
 <ct:contentTypeSchema xmlns:ct="http://schemas.microsoft.com/office/2006/metadata/contentType" xmlns:ma="http://schemas.microsoft.com/office/2006/metadata/properties/metaAttributes" ct:_="" ma:_="" ma:contentTypeName="Document" ma:contentTypeID="0x0101008709E5EBF977394D926FD50F1F28090E" ma:contentTypeVersion="8" ma:contentTypeDescription="Create a new document." ma:contentTypeScope="" ma:versionID="5f47b485a837666779b77ef063a485bc">
   <xsd:schema xmlns:xsd="http://www.w3.org/2001/XMLSchema" xmlns:xs="http://www.w3.org/2001/XMLSchema" xmlns:p="http://schemas.microsoft.com/office/2006/metadata/properties" xmlns:ns3="4d421c5c-29e1-43b5-bbfa-45595c37891d" targetNamespace="http://schemas.microsoft.com/office/2006/metadata/properties" ma:root="true" ma:fieldsID="406362bcd5f856baadaa96fd950ab522" ns3:_="">
     <xsd:import namespace="4d421c5c-29e1-43b5-bbfa-45595c37891d"/>
@@ -17812,7 +17804,19 @@
 </ct:contentTypeSchema>
 </file>
 
+<file path=customXml/item4.xml><?xml version="1.0" encoding="utf-8"?>
+<b:Sources xmlns:b="http://schemas.openxmlformats.org/officeDocument/2006/bibliography" xmlns="http://schemas.openxmlformats.org/officeDocument/2006/bibliography" SelectedStyle="\HarvardAnglia2008OfficeOnline.xsl" StyleName="Harvard - Anglia" Version="2008"/>
+</file>
+
 <file path=customXml/itemProps1.xml><?xml version="1.0" encoding="utf-8"?>
+<ds:datastoreItem xmlns:ds="http://schemas.openxmlformats.org/officeDocument/2006/customXml" ds:itemID="{A5FB38FE-7660-4E6D-ABF6-1F350986DC82}">
+  <ds:schemaRefs>
+    <ds:schemaRef ds:uri="http://schemas.microsoft.com/sharepoint/v3/contenttype/forms"/>
+  </ds:schemaRefs>
+</ds:datastoreItem>
+</file>
+
+<file path=customXml/itemProps2.xml><?xml version="1.0" encoding="utf-8"?>
 <ds:datastoreItem xmlns:ds="http://schemas.openxmlformats.org/officeDocument/2006/customXml" ds:itemID="{6E47FFE9-50EF-41E0-BEAD-2B3BE4B020C8}">
   <ds:schemaRefs>
     <ds:schemaRef ds:uri="http://schemas.microsoft.com/office/2006/metadata/properties"/>
@@ -17821,23 +17825,7 @@
 </ds:datastoreItem>
 </file>
 
-<file path=customXml/itemProps2.xml><?xml version="1.0" encoding="utf-8"?>
-<ds:datastoreItem xmlns:ds="http://schemas.openxmlformats.org/officeDocument/2006/customXml" ds:itemID="{2A87FF2B-5132-4984-888F-C6439C4B77F2}">
-  <ds:schemaRefs>
-    <ds:schemaRef ds:uri="http://schemas.openxmlformats.org/officeDocument/2006/bibliography"/>
-  </ds:schemaRefs>
-</ds:datastoreItem>
-</file>
-
 <file path=customXml/itemProps3.xml><?xml version="1.0" encoding="utf-8"?>
-<ds:datastoreItem xmlns:ds="http://schemas.openxmlformats.org/officeDocument/2006/customXml" ds:itemID="{A5FB38FE-7660-4E6D-ABF6-1F350986DC82}">
-  <ds:schemaRefs>
-    <ds:schemaRef ds:uri="http://schemas.microsoft.com/sharepoint/v3/contenttype/forms"/>
-  </ds:schemaRefs>
-</ds:datastoreItem>
-</file>
-
-<file path=customXml/itemProps4.xml><?xml version="1.0" encoding="utf-8"?>
 <ds:datastoreItem xmlns:ds="http://schemas.openxmlformats.org/officeDocument/2006/customXml" ds:itemID="{85614D37-CD62-4F17-84D7-79958F364CAF}">
   <ds:schemaRefs>
     <ds:schemaRef ds:uri="http://schemas.microsoft.com/office/2006/metadata/contentType"/>
@@ -17853,4 +17841,12 @@
     <ds:schemaRef ds:uri="http://schemas.microsoft.com/internal/obd"/>
   </ds:schemaRefs>
 </ds:datastoreItem>
+</file>
+
+<file path=customXml/itemProps4.xml><?xml version="1.0" encoding="utf-8"?>
+<ds:datastoreItem xmlns:ds="http://schemas.openxmlformats.org/officeDocument/2006/customXml" ds:itemID="{2A87FF2B-5132-4984-888F-C6439C4B77F2}">
+  <ds:schemaRefs>
+    <ds:schemaRef ds:uri="http://schemas.openxmlformats.org/officeDocument/2006/bibliography"/>
+  </ds:schemaRefs>
+</ds:datastoreItem>
 </file>
</xml_diff>